<commit_message>
Grade 7 Salt naming: students drag the pieces to build the products (Explore, quiz step 2, new Build the formula tab, also backwards), quiz without trap words, tip after the 1st wrong answer and the answer after the 2nd; worksheet question 14
</commit_message>
<xml_diff>
--- a/science/g07/01-salt-naming/worksheet.docx
+++ b/science/g07/01-salt-naming/worksheet.docx
@@ -2896,7 +2896,7 @@
       <w:tr>
         <w:trPr>
           <w:cantSplit/>
-          <w:trHeight w:val="510" w:hRule="atLeast"/>
+          <w:trHeight w:val="425" w:hRule="atLeast"/>
         </w:trPr>
         <w:tc>
           <w:tcPr>
@@ -2979,7 +2979,7 @@
       <w:tr>
         <w:trPr>
           <w:cantSplit/>
-          <w:trHeight w:val="510" w:hRule="atLeast"/>
+          <w:trHeight w:val="425" w:hRule="atLeast"/>
         </w:trPr>
         <w:tc>
           <w:tcPr>
@@ -3062,7 +3062,7 @@
       <w:tr>
         <w:trPr>
           <w:cantSplit/>
-          <w:trHeight w:val="510" w:hRule="atLeast"/>
+          <w:trHeight w:val="425" w:hRule="atLeast"/>
         </w:trPr>
         <w:tc>
           <w:tcPr>
@@ -3145,7 +3145,7 @@
       <w:tr>
         <w:trPr>
           <w:cantSplit/>
-          <w:trHeight w:val="510" w:hRule="atLeast"/>
+          <w:trHeight w:val="425" w:hRule="atLeast"/>
         </w:trPr>
         <w:tc>
           <w:tcPr>
@@ -3228,7 +3228,7 @@
       <w:tr>
         <w:trPr>
           <w:cantSplit/>
-          <w:trHeight w:val="510" w:hRule="atLeast"/>
+          <w:trHeight w:val="425" w:hRule="atLeast"/>
         </w:trPr>
         <w:tc>
           <w:tcPr>
@@ -3355,7 +3355,7 @@
       <w:tr>
         <w:trPr>
           <w:cantSplit/>
-          <w:trHeight w:val="1615" w:hRule="exact"/>
+          <w:trHeight w:val="1134" w:hRule="exact"/>
         </w:trPr>
         <w:tc>
           <w:tcPr>
@@ -3437,7 +3437,7 @@
       <w:tr>
         <w:trPr>
           <w:cantSplit/>
-          <w:trHeight w:val="2097" w:hRule="exact"/>
+          <w:trHeight w:val="1374" w:hRule="exact"/>
         </w:trPr>
         <w:tc>
           <w:tcPr>
@@ -3473,6 +3473,376 @@
       </w:r>
       <w:r>
         <w:rPr>
+          <w:sz w:val="22"/>
+        </w:rPr>
+        <w:t xml:space="preserve">Open </w:t>
+      </w:r>
+      <w:r>
+        <w:rPr>
+          <w:b/>
+          <w:sz w:val="22"/>
+        </w:rPr>
+        <w:t>3 · Build the formula</w:t>
+      </w:r>
+      <w:r>
+        <w:rPr>
+          <w:sz w:val="22"/>
+        </w:rPr>
+        <w:t xml:space="preserve"> and play one round (8 reactions): drag the pieces to build the salt and the water, or work backwards to the acid and the alkali. Choose </w:t>
+      </w:r>
+      <w:r>
+        <w:rPr>
+          <w:b/>
+          <w:sz w:val="22"/>
+        </w:rPr>
+        <w:t>three</w:t>
+      </w:r>
+      <w:r>
+        <w:rPr>
+          <w:sz w:val="22"/>
+        </w:rPr>
+        <w:t xml:space="preserve"> reactions and fill in the table. The simulation adds the small numbers for you.</w:t>
+      </w:r>
+    </w:p>
+    <w:tbl>
+      <w:tblPr>
+        <w:tblStyle w:val="TableGrid"/>
+        <w:tblW w:type="auto" w:w="0"/>
+        <w:jc w:val="center"/>
+        <w:tblLayout w:type="fixed"/>
+        <w:tblLook w:firstColumn="1" w:firstRow="1" w:lastColumn="0" w:lastRow="0" w:noHBand="0" w:noVBand="1" w:val="04A0"/>
+        <w:tblLayout w:type="fixed"/>
+      </w:tblPr>
+      <w:tblGrid>
+        <w:gridCol w:w="2600"/>
+        <w:gridCol w:w="2600"/>
+        <w:gridCol w:w="2700"/>
+        <w:gridCol w:w="1738"/>
+      </w:tblGrid>
+      <w:tr>
+        <w:trPr>
+          <w:cantSplit/>
+          <w:tblHeader/>
+        </w:trPr>
+        <w:tc>
+          <w:tcPr>
+            <w:tcW w:type="dxa" w:w="2600"/>
+            <w:shd w:val="clear" w:color="auto" w:fill="1F3A5F"/>
+            <w:tcMar>
+              <w:top w:w="60" w:type="dxa"/>
+              <w:left w:w="60" w:type="dxa"/>
+              <w:bottom w:w="60" w:type="dxa"/>
+              <w:right w:w="60" w:type="dxa"/>
+            </w:tcMar>
+          </w:tcPr>
+          <w:p>
+            <w:pPr>
+              <w:keepNext/>
+            </w:pPr>
+            <w:r>
+              <w:rPr>
+                <w:b/>
+                <w:color w:val="FFFFFF"/>
+                <w:sz w:val="20"/>
+              </w:rPr>
+              <w:t>Acid</w:t>
+            </w:r>
+          </w:p>
+        </w:tc>
+        <w:tc>
+          <w:tcPr>
+            <w:tcW w:type="dxa" w:w="2600"/>
+            <w:shd w:val="clear" w:color="auto" w:fill="1F3A5F"/>
+            <w:tcMar>
+              <w:top w:w="60" w:type="dxa"/>
+              <w:left w:w="60" w:type="dxa"/>
+              <w:bottom w:w="60" w:type="dxa"/>
+              <w:right w:w="60" w:type="dxa"/>
+            </w:tcMar>
+          </w:tcPr>
+          <w:p>
+            <w:pPr>
+              <w:keepNext/>
+            </w:pPr>
+            <w:r>
+              <w:rPr>
+                <w:b/>
+                <w:color w:val="FFFFFF"/>
+                <w:sz w:val="20"/>
+              </w:rPr>
+              <w:t>Alkali or base</w:t>
+            </w:r>
+          </w:p>
+        </w:tc>
+        <w:tc>
+          <w:tcPr>
+            <w:tcW w:type="dxa" w:w="2700"/>
+            <w:shd w:val="clear" w:color="auto" w:fill="1F3A5F"/>
+            <w:tcMar>
+              <w:top w:w="60" w:type="dxa"/>
+              <w:left w:w="60" w:type="dxa"/>
+              <w:bottom w:w="60" w:type="dxa"/>
+              <w:right w:w="60" w:type="dxa"/>
+            </w:tcMar>
+          </w:tcPr>
+          <w:p>
+            <w:pPr>
+              <w:keepNext/>
+            </w:pPr>
+            <w:r>
+              <w:rPr>
+                <w:b/>
+                <w:color w:val="FFFFFF"/>
+                <w:sz w:val="20"/>
+              </w:rPr>
+              <w:t>Salt (name)</w:t>
+            </w:r>
+          </w:p>
+        </w:tc>
+        <w:tc>
+          <w:tcPr>
+            <w:tcW w:type="dxa" w:w="1738"/>
+            <w:shd w:val="clear" w:color="auto" w:fill="1F3A5F"/>
+            <w:tcMar>
+              <w:top w:w="60" w:type="dxa"/>
+              <w:left w:w="60" w:type="dxa"/>
+              <w:bottom w:w="60" w:type="dxa"/>
+              <w:right w:w="60" w:type="dxa"/>
+            </w:tcMar>
+          </w:tcPr>
+          <w:p>
+            <w:pPr>
+              <w:keepNext/>
+            </w:pPr>
+            <w:r>
+              <w:rPr>
+                <w:b/>
+                <w:color w:val="FFFFFF"/>
+                <w:sz w:val="20"/>
+              </w:rPr>
+              <w:t>Salt formula</w:t>
+            </w:r>
+          </w:p>
+        </w:tc>
+      </w:tr>
+      <w:tr>
+        <w:trPr>
+          <w:cantSplit/>
+          <w:trHeight w:val="425" w:hRule="atLeast"/>
+        </w:trPr>
+        <w:tc>
+          <w:tcPr>
+            <w:tcW w:type="dxa" w:w="2600"/>
+            <w:shd w:val="clear" w:color="auto" w:fill="F5F7FA"/>
+            <w:tcMar>
+              <w:top w:w="60" w:type="dxa"/>
+              <w:left w:w="60" w:type="dxa"/>
+              <w:bottom w:w="60" w:type="dxa"/>
+              <w:right w:w="60" w:type="dxa"/>
+            </w:tcMar>
+          </w:tcPr>
+          <w:p>
+            <w:pPr>
+              <w:keepNext/>
+            </w:pPr>
+          </w:p>
+        </w:tc>
+        <w:tc>
+          <w:tcPr>
+            <w:tcW w:type="dxa" w:w="2600"/>
+            <w:tcMar>
+              <w:top w:w="60" w:type="dxa"/>
+              <w:left w:w="60" w:type="dxa"/>
+              <w:bottom w:w="60" w:type="dxa"/>
+              <w:right w:w="60" w:type="dxa"/>
+            </w:tcMar>
+          </w:tcPr>
+          <w:p>
+            <w:pPr>
+              <w:keepNext/>
+            </w:pPr>
+          </w:p>
+        </w:tc>
+        <w:tc>
+          <w:tcPr>
+            <w:tcW w:type="dxa" w:w="2700"/>
+            <w:tcMar>
+              <w:top w:w="60" w:type="dxa"/>
+              <w:left w:w="60" w:type="dxa"/>
+              <w:bottom w:w="60" w:type="dxa"/>
+              <w:right w:w="60" w:type="dxa"/>
+            </w:tcMar>
+          </w:tcPr>
+          <w:p>
+            <w:pPr>
+              <w:keepNext/>
+            </w:pPr>
+          </w:p>
+        </w:tc>
+        <w:tc>
+          <w:tcPr>
+            <w:tcW w:type="dxa" w:w="1738"/>
+            <w:tcMar>
+              <w:top w:w="60" w:type="dxa"/>
+              <w:left w:w="60" w:type="dxa"/>
+              <w:bottom w:w="60" w:type="dxa"/>
+              <w:right w:w="60" w:type="dxa"/>
+            </w:tcMar>
+          </w:tcPr>
+          <w:p>
+            <w:pPr>
+              <w:keepNext/>
+            </w:pPr>
+          </w:p>
+        </w:tc>
+      </w:tr>
+      <w:tr>
+        <w:trPr>
+          <w:cantSplit/>
+          <w:trHeight w:val="425" w:hRule="atLeast"/>
+        </w:trPr>
+        <w:tc>
+          <w:tcPr>
+            <w:tcW w:type="dxa" w:w="2600"/>
+            <w:shd w:val="clear" w:color="auto" w:fill="F5F7FA"/>
+            <w:tcMar>
+              <w:top w:w="60" w:type="dxa"/>
+              <w:left w:w="60" w:type="dxa"/>
+              <w:bottom w:w="60" w:type="dxa"/>
+              <w:right w:w="60" w:type="dxa"/>
+            </w:tcMar>
+          </w:tcPr>
+          <w:p>
+            <w:pPr>
+              <w:keepNext/>
+            </w:pPr>
+          </w:p>
+        </w:tc>
+        <w:tc>
+          <w:tcPr>
+            <w:tcW w:type="dxa" w:w="2600"/>
+            <w:tcMar>
+              <w:top w:w="60" w:type="dxa"/>
+              <w:left w:w="60" w:type="dxa"/>
+              <w:bottom w:w="60" w:type="dxa"/>
+              <w:right w:w="60" w:type="dxa"/>
+            </w:tcMar>
+          </w:tcPr>
+          <w:p>
+            <w:pPr>
+              <w:keepNext/>
+            </w:pPr>
+          </w:p>
+        </w:tc>
+        <w:tc>
+          <w:tcPr>
+            <w:tcW w:type="dxa" w:w="2700"/>
+            <w:tcMar>
+              <w:top w:w="60" w:type="dxa"/>
+              <w:left w:w="60" w:type="dxa"/>
+              <w:bottom w:w="60" w:type="dxa"/>
+              <w:right w:w="60" w:type="dxa"/>
+            </w:tcMar>
+          </w:tcPr>
+          <w:p>
+            <w:pPr>
+              <w:keepNext/>
+            </w:pPr>
+          </w:p>
+        </w:tc>
+        <w:tc>
+          <w:tcPr>
+            <w:tcW w:type="dxa" w:w="1738"/>
+            <w:tcMar>
+              <w:top w:w="60" w:type="dxa"/>
+              <w:left w:w="60" w:type="dxa"/>
+              <w:bottom w:w="60" w:type="dxa"/>
+              <w:right w:w="60" w:type="dxa"/>
+            </w:tcMar>
+          </w:tcPr>
+          <w:p>
+            <w:pPr>
+              <w:keepNext/>
+            </w:pPr>
+          </w:p>
+        </w:tc>
+      </w:tr>
+      <w:tr>
+        <w:trPr>
+          <w:cantSplit/>
+          <w:trHeight w:val="425" w:hRule="atLeast"/>
+        </w:trPr>
+        <w:tc>
+          <w:tcPr>
+            <w:tcW w:type="dxa" w:w="2600"/>
+            <w:shd w:val="clear" w:color="auto" w:fill="F5F7FA"/>
+            <w:tcMar>
+              <w:top w:w="60" w:type="dxa"/>
+              <w:left w:w="60" w:type="dxa"/>
+              <w:bottom w:w="60" w:type="dxa"/>
+              <w:right w:w="60" w:type="dxa"/>
+            </w:tcMar>
+          </w:tcPr>
+          <w:p/>
+        </w:tc>
+        <w:tc>
+          <w:tcPr>
+            <w:tcW w:type="dxa" w:w="2600"/>
+            <w:tcMar>
+              <w:top w:w="60" w:type="dxa"/>
+              <w:left w:w="60" w:type="dxa"/>
+              <w:bottom w:w="60" w:type="dxa"/>
+              <w:right w:w="60" w:type="dxa"/>
+            </w:tcMar>
+          </w:tcPr>
+          <w:p/>
+        </w:tc>
+        <w:tc>
+          <w:tcPr>
+            <w:tcW w:type="dxa" w:w="2700"/>
+            <w:tcMar>
+              <w:top w:w="60" w:type="dxa"/>
+              <w:left w:w="60" w:type="dxa"/>
+              <w:bottom w:w="60" w:type="dxa"/>
+              <w:right w:w="60" w:type="dxa"/>
+            </w:tcMar>
+          </w:tcPr>
+          <w:p/>
+        </w:tc>
+        <w:tc>
+          <w:tcPr>
+            <w:tcW w:type="dxa" w:w="1738"/>
+            <w:tcMar>
+              <w:top w:w="60" w:type="dxa"/>
+              <w:left w:w="60" w:type="dxa"/>
+              <w:bottom w:w="60" w:type="dxa"/>
+              <w:right w:w="60" w:type="dxa"/>
+            </w:tcMar>
+          </w:tcPr>
+          <w:p/>
+        </w:tc>
+      </w:tr>
+    </w:tbl>
+    <w:p>
+      <w:pPr>
+        <w:spacing w:after="40"/>
+      </w:pPr>
+    </w:p>
+    <w:p>
+      <w:pPr>
+        <w:keepNext/>
+        <w:spacing w:before="120" w:after="80"/>
+      </w:pPr>
+      <w:r>
+        <w:rPr>
+          <w:b/>
+          <w:color w:val="1F3A5F"/>
+          <w:sz w:val="22"/>
+        </w:rPr>
+        <w:t xml:space="preserve">15  </w:t>
+      </w:r>
+      <w:r>
+        <w:rPr>
           <w:b/>
           <w:sz w:val="22"/>
         </w:rPr>
@@ -3500,7 +3870,7 @@
       <w:tr>
         <w:trPr>
           <w:cantSplit/>
-          <w:trHeight w:val="2097" w:hRule="exact"/>
+          <w:trHeight w:val="1374" w:hRule="exact"/>
         </w:trPr>
         <w:tc>
           <w:tcPr>
@@ -3516,11 +3886,6 @@
         </w:tc>
       </w:tr>
     </w:tbl>
-    <w:p>
-      <w:pPr>
-        <w:spacing w:after="40"/>
-      </w:pPr>
-    </w:p>
     <w:sectPr>
       <w:headerReference w:type="default" r:id="rId9"/>
       <w:footerReference w:type="default" r:id="rId10"/>

</xml_diff>